<commit_message>
feat: add windows packaging skeleton
</commit_message>
<xml_diff>
--- a/Repository/Package0.0/AGV_Graduation_Project/PROJECT_IMPLEMENTATION_PLAN_v2.0.docx
+++ b/Repository/Package0.0/AGV_Graduation_Project/PROJECT_IMPLEMENTATION_PLAN_v2.0.docx
@@ -110,7 +110,7 @@
     </w:p>
     <w:p>
       <w:r>
-        <w:t xml:space="preserve">| 模块 2 | 最低可交付版封装试运行 | 未开始 | 下一阶段优先项。 |</w:t>
+        <w:t xml:space="preserve">| 模块 2 | 最低可交付版封装试运行 | 进行中（首版骨架已完成） | 已补前端 `dist` 构建、后端静态托管、PyInstaller 入口/spec 与启动器脚本。 |</w:t>
       </w:r>
     </w:p>
     <w:p>
@@ -611,6 +611,66 @@
     <w:p>
       <w:r>
         <w:t xml:space="preserve">- 自动 / 手动 / 多段任务、点位、模板、障碍预设均可操作。</w:t>
+      </w:r>
+    </w:p>
+    <w:p/>
+    <w:p>
+      <w:r>
+        <w:rPr>
+          <w:b/>
+          <w:sz w:val="24"/>
+        </w:rPr>
+        <w:t>本轮落地结果</w:t>
+      </w:r>
+    </w:p>
+    <w:p>
+      <w:r>
+        <w:t xml:space="preserve">- 已新增 `build_frontend_dist.bat`</w:t>
+      </w:r>
+    </w:p>
+    <w:p>
+      <w:r>
+        <w:t xml:space="preserve">- 已新增 `run_packaged_dev.bat`</w:t>
+      </w:r>
+    </w:p>
+    <w:p>
+      <w:r>
+        <w:t xml:space="preserve">- 已新增 `build_windows_package.bat`</w:t>
+      </w:r>
+    </w:p>
+    <w:p>
+      <w:r>
+        <w:t xml:space="preserve">- 已新增 `start_agv.bat`</w:t>
+      </w:r>
+    </w:p>
+    <w:p>
+      <w:r>
+        <w:t xml:space="preserve">- 已新增 `backend/package_entry.py`</w:t>
+      </w:r>
+    </w:p>
+    <w:p>
+      <w:r>
+        <w:t xml:space="preserve">- 已新增 `backend/packaging/backend.spec`</w:t>
+      </w:r>
+    </w:p>
+    <w:p>
+      <w:r>
+        <w:t xml:space="preserve">- 已新增 `backend/requirements-package.txt`</w:t>
+      </w:r>
+    </w:p>
+    <w:p>
+      <w:r>
+        <w:t xml:space="preserve">- 已新增 `PACKAGING_WINDOWS.md`</w:t>
+      </w:r>
+    </w:p>
+    <w:p>
+      <w:r>
+        <w:t xml:space="preserve">- 后端已支持在 `AGV_SERVE_FRONTEND_DIST=true` 时直接托管前端 `dist`</w:t>
+      </w:r>
+    </w:p>
+    <w:p>
+      <w:r>
+        <w:t xml:space="preserve">- 前端 API 地址已调整为兼容“Vite 开发模式”和“后端同源托管模式”</w:t>
       </w:r>
     </w:p>
     <w:p/>

</xml_diff>

<commit_message>
feat: validate windows packaging flow
</commit_message>
<xml_diff>
--- a/Repository/Package0.0/AGV_Graduation_Project/PROJECT_IMPLEMENTATION_PLAN_v2.0.docx
+++ b/Repository/Package0.0/AGV_Graduation_Project/PROJECT_IMPLEMENTATION_PLAN_v2.0.docx
@@ -110,7 +110,7 @@
     </w:p>
     <w:p>
       <w:r>
-        <w:t xml:space="preserve">| 模块 2 | 最低可交付版封装试运行 | 进行中（首版骨架已完成） | 已补前端 `dist` 构建、后端静态托管、PyInstaller 入口/spec 与启动器脚本。 |</w:t>
+        <w:t xml:space="preserve">| 模块 2 | 最低可交付版封装试运行 | 已完成（首版试运行） | 已完成前端 `dist` 构建、后端静态托管、PyInstaller one-folder 打包与封装包烟雾测试。 |</w:t>
       </w:r>
     </w:p>
     <w:p>
@@ -671,6 +671,26 @@
     <w:p>
       <w:r>
         <w:t xml:space="preserve">- 前端 API 地址已调整为兼容“Vite 开发模式”和“后端同源托管模式”</w:t>
+      </w:r>
+    </w:p>
+    <w:p>
+      <w:r>
+        <w:t xml:space="preserve">- 已成功构建 `dist/AGV_Dispatch_Package/`</w:t>
+      </w:r>
+    </w:p>
+    <w:p>
+      <w:r>
+        <w:t xml:space="preserve">- 已完成封装包 `backend.exe` 烟雾测试：</w:t>
+      </w:r>
+    </w:p>
+    <w:p>
+      <w:r>
+        <w:t xml:space="preserve">  - 根路径返回前端 HTML</w:t>
+      </w:r>
+    </w:p>
+    <w:p>
+      <w:r>
+        <w:t xml:space="preserve">  - `/status/ui-settings` 接口可正常访问</w:t>
       </w:r>
     </w:p>
     <w:p/>

</xml_diff>